<commit_message>
Verify every citation in Chapters 0 to 6 against the literature
All 412 unique citations were checked against CrossRef, PubMed, publisher
or library catalogue records. 410 confirmed as cited; two corrected:
Barresi & Gilbert (2019) author order for the 12th edition of
Developmental Biology (Chapter 0), and the 1906 first edition of
Sherrington's Integrative Action was published by Charles Scribner's
Sons, not Yale University Press (Chapter 4). Reference lists re-sorted,
footnotes updated, Word and PDF rebuilt. Evidence for every citation is
recorded in docs/reference_verification.md.

Co-Authored-By: Claude Fable 5.1 <noreply@anthropic.com>
</commit_message>
<xml_diff>
--- a/docs/book/Word/Chapter0/How_the_Brain_Learns_Chapter_0_Foundations.docx
+++ b/docs/book/Word/Chapter0/How_the_Brain_Learns_Chapter_0_Foundations.docx
@@ -2921,6 +2921,30 @@
         <w:pStyle w:val="BodyText"/>
       </w:pPr>
       <w:r>
+        <w:t xml:space="preserve">Barresi, M. J. F., &amp; Gilbert, S. F. (2019).</w:t>
+      </w:r>
+      <w:r>
+        <w:t xml:space="preserve"> </w:t>
+      </w:r>
+      <w:r>
+        <w:rPr>
+          <w:iCs/>
+          <w:i/>
+        </w:rPr>
+        <w:t xml:space="preserve">Developmental Biology</w:t>
+      </w:r>
+      <w:r>
+        <w:t xml:space="preserve"> </w:t>
+      </w:r>
+      <w:r>
+        <w:t xml:space="preserve">(12th ed.). Sinauer Associates.</w:t>
+      </w:r>
+    </w:p>
+    <w:p>
+      <w:pPr>
+        <w:pStyle w:val="BodyText"/>
+      </w:pPr>
+      <w:r>
         <w:t xml:space="preserve">Berg, H. C. (1993).</w:t>
       </w:r>
       <w:r>
@@ -3190,30 +3214,6 @@
       </w:r>
       <w:r>
         <w:t xml:space="preserve">. Bologna: Ex Typographia Instituti Scientiarum.</w:t>
-      </w:r>
-    </w:p>
-    <w:p>
-      <w:pPr>
-        <w:pStyle w:val="BodyText"/>
-      </w:pPr>
-      <w:r>
-        <w:t xml:space="preserve">Gilbert, S. F., &amp; Barresi, M. J. F. (2019).</w:t>
-      </w:r>
-      <w:r>
-        <w:t xml:space="preserve"> </w:t>
-      </w:r>
-      <w:r>
-        <w:rPr>
-          <w:iCs/>
-          <w:i/>
-        </w:rPr>
-        <w:t xml:space="preserve">Developmental Biology</w:t>
-      </w:r>
-      <w:r>
-        <w:t xml:space="preserve"> </w:t>
-      </w:r>
-      <w:r>
-        <w:t xml:space="preserve">(12th ed.). Sinauer Associates.</w:t>
       </w:r>
     </w:p>
     <w:p>
@@ -5164,7 +5164,7 @@
         <w:t xml:space="preserve"> </w:t>
       </w:r>
       <w:r>
-        <w:t xml:space="preserve">Gilbert, S. F., &amp; Barresi, M. J. F. (2019).</w:t>
+        <w:t xml:space="preserve">Barresi, M. J. F., &amp; Gilbert, S. F. (2019).</w:t>
       </w:r>
       <w:r>
         <w:t xml:space="preserve"> </w:t>

</xml_diff>